<commit_message>
Comité CGN: protocolo y diapositivas alineados con la carta editada; páginas de la carta actualizadas
Co-Authored-By: Claude Opus 5.5 <noreply@anthropic.com>
Claude-Session: https://claude.ai/code/session_01A2a3kkCw22mKtZ4h9yLDKX
</commit_message>
<xml_diff>
--- a/comite_etica_CGN/Protocolo_v2.0_ajustes_resaltados.docx
+++ b/comite_etica_CGN/Protocolo_v2.0_ajustes_resaltados.docx
@@ -1797,7 +1797,7 @@
         </w:rPr>
         <w:t xml:space="preserve">3.9.2 Interpretación y publicación de los resultados</w:t>
         <w:tab/>
-        <w:t>44</w:t>
+        <w:t>43</w:t>
       </w:r>
     </w:p>
     <w:p>
@@ -2777,7 +2777,7 @@
           <w:szCs w:val="24"/>
           <w:highlight w:val="yellow"/>
         </w:rPr>
-        <w:t xml:space="preserve">La población se delimitó a pacientes Testigos de Jehová con rechazo transfusional documentado por razones de comparabilidad, homogeneidad clínica y justicia. La evidencia de referencia sobre cirugía cardiaca sin transfusión —metaanálisis, cohortes emparejadas y series institucionales— define su población de esta manera, y «Testigos de Jehová» es un descriptor controlado en DeCS y MeSH (5-8,17,19,22,23,34,35,44,62); describir una cohorte con la misma definición es la condición para contrastar los resultados institucionales con esa literatura. Este contraste es necesario porque los resultados varían entre centros: frente a mortalidades hospitalarias de 0,6 % a 3,1 % en centros especializados (6,7), un hospital terciario brasileño informó una mortalidad del 18,8 % en Testigos de Jehová y del 4,2 % en sus controles (63). Durante el periodo de estudio, además, la condición de Testigo de Jehová se asociaba con una negativa anticipada, estable y documentada a los componentes principales de la sangre, que daba lugar a una planificación perioperatoria específica desde el preoperatorio (1,4); el rechazo transfusional de pacientes sin esta condición es infrecuente en cirugía cardiaca, suele ser parcial o circunstancial y carece de un registro homogéneo. Por esa razón, la cohorte de Pattakos et al. estudió el rechazo de transfusión en Testigos de Jehová como un «experimento natural» de conservación sanguínea estricta (7).</w:t>
+        <w:t xml:space="preserve">La población se delimitó a pacientes Testigos de Jehová con rechazo transfusional documentado por razones de comparabilidad, homogeneidad clínica y justicia. La evidencia de referencia sobre cirugía cardiaca sin transfusión —metaanálisis, cohortes emparejadas y series institucionales— define su población de esta manera, y «Testigos de Jehová» es un descriptor controlado en DeCS y MeSH (5-8,17,19,22,23,34,35,44,61); describir una cohorte con la misma definición es la condición para contrastar los resultados institucionales con esa literatura. Este contraste es necesario porque los resultados varían entre centros: frente a mortalidades hospitalarias de 0,6 % a 3,1 % en centros especializados (6,7), un hospital terciario brasileño informó una mortalidad del 18,8 % en Testigos de Jehová y del 4,2 % en sus controles (62). Durante el periodo de estudio, además, la condición de Testigo de Jehová se asociaba con una negativa anticipada, estable y documentada a los componentes principales de la sangre, que daba lugar a una planificación perioperatoria específica desde el preoperatorio (1,4); el rechazo transfusional de pacientes sin esta condición es infrecuente en cirugía cardiaca, suele ser parcial o circunstancial y carece de un registro homogéneo. Por esa razón, la cohorte de Pattakos et al. estudió el rechazo de transfusión en Testigos de Jehová como un «experimento natural» de conservación sanguínea estricta (7).</w:t>
       </w:r>
     </w:p>
     <w:p>
@@ -2791,7 +2791,7 @@
           <w:szCs w:val="24"/>
           <w:highlight w:val="yellow"/>
         </w:rPr>
-        <w:t xml:space="preserve">La investigación también responde a un criterio de justicia. La Corte Constitucional ha reconocido el derecho de los pacientes Testigos de Jehová plenamente capaces a recibir tratamiento sin transfusión, incluida la cirugía cardiovascular (58,59), de modo que conocer los resultados locales de esa atención beneficia directamente a esta población, en concordancia con la distribución equitativa de cargas y beneficios de la investigación (10,54). La afiliación religiosa delimita la población, pero no es una variable de exposición ni de análisis: es constante en la cohorte y no se compararán Testigos de Jehová con otros grupos. La elegibilidad operativa depende de la decisión clínica individual documentada (numeral 3.2.2).</w:t>
+        <w:t xml:space="preserve">La investigación también responde a un criterio de justicia. La Corte Constitucional ha reconocido el derecho de los pacientes Testigos de Jehová plenamente capaces a recibir tratamiento sin transfusión, incluida la cirugía cardiovascular (57,58), de modo que conocer los resultados locales de esa atención beneficia directamente a esta población, en concordancia con la distribución equitativa de cargas y beneficios de la investigación (10,54). La afiliación religiosa delimita la población, pero no es una variable de exposición ni de análisis: es constante en la cohorte y no se compararán Testigos de Jehová con otros grupos. La elegibilidad operativa depende de la decisión clínica individual documentada (numeral 3.2.2).</w:t>
       </w:r>
     </w:p>
     <w:p>
@@ -8363,7 +8363,7 @@
           <w:szCs w:val="24"/>
           <w:highlight w:val="yellow"/>
         </w:rPr>
-        <w:t xml:space="preserve">La Constitución Política protege la intimidad y el habeas data (artículo 15), el libre desarrollo de la personalidad (artículo 16), la libertad de conciencia (artículo 18) y la libertad de cultos (artículo 19). La Ley Estatutaria 133 de 1994 desarrolla la libertad religiosa, y la Ley Estatutaria 1751 de 2015 reconoce el derecho a recibir información suficiente para tomar decisiones libres e informadas sobre los procedimientos, así como la reserva de la historia clínica y la intimidad (artículo 10) (60,61). La Corte Constitucional ha reiterado que la negativa informada de un paciente capaz a recibir transfusiones por motivos religiosos es expresión de su autonomía, que las instituciones deben armonizar con el derecho a la salud mediante alternativas terapéuticas; en un caso de insuficiencia aórtica ordenó practicar el reemplazo valvular sin transfusión (58,59). En este marco, la cirugía cardiaca sin transfusión es una alternativa que el sistema de salud debe garantizar, y conocer sus resultados contribuye a hacerlo con seguridad.</w:t>
+        <w:t xml:space="preserve">La Constitución Política protege la intimidad y el habeas data (artículo 15), el libre desarrollo de la personalidad (artículo 16), la libertad de conciencia (artículo 18) y la libertad de cultos (artículo 19). La Ley Estatutaria 133 de 1994 desarrolla la libertad religiosa, y la Ley Estatutaria 1751 de 2015 reconoce el derecho a recibir información suficiente para tomar decisiones libres e informadas sobre los procedimientos, así como la reserva de la historia clínica y la intimidad (artículo 10) (59,60). La Corte Constitucional ha reiterado que la negativa informada de un paciente capaz a recibir transfusiones por motivos religiosos es expresión de su autonomía, que las instituciones deben armonizar con el derecho a la salud mediante alternativas terapéuticas; en un caso de insuficiencia aórtica ordenó practicar el reemplazo valvular sin transfusión (57,58). En este marco, la cirugía cardiaca sin transfusión es una alternativa que el sistema de salud debe garantizar, y conocer sus resultados contribuye a hacerlo con seguridad.</w:t>
       </w:r>
     </w:p>
     <w:p>
@@ -21558,7 +21558,7 @@
           <w:szCs w:val="24"/>
           <w:highlight w:val="yellow"/>
         </w:rPr>
-        <w:t xml:space="preserve">La solicitud de dispensa se sustenta en condiciones concurrentes previstas en la Resolución 8430 de 1993, la Ley 1581 de 2012 y la pauta 10 de CIOMS-OMS (13,14,54). Se trata de una investigación sin riesgo, requisito del parágrafo primero del artículo 16. La obtención del consentimiento es impracticable: la cohorte incluye pacientes atendidos entre 2020 y 2025, una parte de ellos previsiblemente fallecida —la mortalidad forma parte del desenlace primario— y otros sin datos de contacto vigentes, y exigirlo excluiría de forma sistemática a los pacientes con peores desenlaces y sesgaría la estimación principal. El contacto, además, exigiría manipular identificadores, revelaría a terceros información religiosa y transfusional, y podría percibirse como un cuestionamiento de decisiones de conciencia ya tomadas. El estudio tiene valor social, porque genera información sobre la seguridad perioperatoria de un grupo cuyo derecho a la cirugía sin transfusión reconoce la jurisprudencia constitucional (58,59), y los datos se tratarán con la finalidad científica y las medidas de supresión de identidad que exigen el literal e) del artículo 6 y el literal d) del artículo 10 de la Ley 1581 de 2012, sin efecto alguno sobre la atención de los pacientes (14). Estudios con diseño y población equivalentes han sido aprobados por comités de ética con dispensa del consentimiento (44,62).</w:t>
+        <w:t xml:space="preserve">La solicitud de dispensa se sustenta en condiciones concurrentes previstas en la Resolución 8430 de 1993, la Ley 1581 de 2012 y la pauta 10 de CIOMS-OMS (13,14,54). Se trata de una investigación sin riesgo, requisito del parágrafo primero del artículo 16. La obtención del consentimiento es impracticable: la cohorte incluye pacientes atendidos entre 2020 y 2025, una parte de ellos previsiblemente fallecida —la mortalidad forma parte del desenlace primario— y otros sin datos de contacto vigentes, y exigirlo excluiría de forma sistemática a los pacientes con peores desenlaces y sesgaría la estimación principal. El contacto, además, exigiría manipular identificadores, revelaría a terceros información religiosa y transfusional, y podría percibirse como un cuestionamiento de decisiones de conciencia ya tomadas. El estudio tiene valor social, porque genera información sobre la seguridad perioperatoria de un grupo cuyo derecho a la cirugía sin transfusión reconoce la jurisprudencia constitucional (57,58), y los datos se tratarán con la finalidad científica y las medidas de supresión de identidad que exigen el literal e) del artículo 6 y el literal d) del artículo 10 de la Ley 1581 de 2012, sin efecto alguno sobre la atención de los pacientes (14). Estudios con diseño y población equivalentes han sido aprobados por comités de ética con dispensa del consentimiento (44,61).</w:t>
       </w:r>
     </w:p>
     <w:p>
@@ -21699,7 +21699,7 @@
           <w:szCs w:val="24"/>
           <w:highlight w:val="yellow"/>
         </w:rPr>
-        <w:t xml:space="preserve"> La historia clínica electrónica se consultará solo con credenciales individuales asignadas por la Clínica, en modo de consulta, dentro de su red y sus instalaciones, y limitada a los pacientes del listado de elegibilidad y a las variables del diccionario. No se harán copias, impresiones, fotografías ni capturas de pantalla de las historias, ni se usarán dispositivos externos, correo personal o servicios de nube no institucionales. La Clínica podrá auditar los accesos.</w:t>
+        <w:t xml:space="preserve"> La historia clínica electrónica se consultará solo con credenciales individuales asignadas por la Clínica, en modo de consulta, dentro de su red y sus instalaciones, y limitada a los pacientes del listado de elegibilidad y a las variables del diccionario. No se harán copias, impresiones, fotografías ni capturas de pantalla de las historias, ni se usarán dispositivos externos. La Clínica podrá auditar los accesos.</w:t>
       </w:r>
     </w:p>
     <w:p>
@@ -21751,7 +21751,7 @@
           <w:szCs w:val="24"/>
           <w:highlight w:val="yellow"/>
         </w:rPr>
-        <w:t xml:space="preserve"> La base se alojará en REDCap institucional, con perfiles de usuario, registro de auditoría y autenticación, o en un archivo cifrado en un servidor de la Clínica o de la Universidad, con copias de respaldo igualmente cifradas, y nunca en equipos personales sin cifrado. Al terminar el plazo de conservación de cinco años, su eliminación se documentará en un acta.</w:t>
+        <w:t xml:space="preserve"> La base se alojará en REDCap institucional, con perfiles de usuario, registro de auditoría y autenticación, o en un archivo cifrado en un servidor de la Clínica o de la Universidad, con copias de respaldo igualmente cifradas, y nunca en equipos personales sin cifrado. Al terminar el plazo de conservación de cinco años, la base será eliminada.</w:t>
       </w:r>
     </w:p>
     <w:p>
@@ -21777,7 +21777,7 @@
           <w:szCs w:val="24"/>
           <w:highlight w:val="yellow"/>
         </w:rPr>
-        <w:t xml:space="preserve"> La tabla de correspondencia entre códigos e identificadores y los listados de la búsqueda de casos se conservarán en un archivo cifrado independiente, en un servidor de la Clínica, al que solo tendrán acceso el investigador principal y un coinvestigador suplente. Esta tabla no se transmitirá con la base analítica y se destruirá, con acta, al concluir la verificación de los datos y el control de calidad, antes del análisis estadístico.</w:t>
+        <w:t xml:space="preserve"> La tabla de correspondencia entre códigos e identificadores y los listados de la búsqueda de casos se conservarán en un archivo cifrado independiente, en un servidor de la Clínica, al que solo tendrán acceso los investigadores. Esta tabla no se transmitirá con la base analítica.</w:t>
       </w:r>
     </w:p>
     <w:p>
@@ -21803,7 +21803,7 @@
           <w:szCs w:val="24"/>
           <w:highlight w:val="yellow"/>
         </w:rPr>
-        <w:t xml:space="preserve"> Se considerará incidente cualquier acceso, pérdida, alteración, divulgación o uso no autorizado de los datos. El incidente se contendrá el mismo día (revocación de accesos, cambio de contraseñas y aislamiento del archivo) y se notificará en las 24 horas siguientes al investigador principal, al área de protección de datos de la Clínica y al comité de ética en investigación; se evaluarán los datos y titulares afectados, y la Clínica, como responsable, informará a la Superintendencia de Industria y Comercio cuando corresponda, conforme al literal n) del artículo 17 de la Ley 1581 de 2012. Se documentarán el incidente, las acciones correctivas y su cierre. La Ley 1273 de 2009 tipifica como delito la violación de datos personales (57).</w:t>
+        <w:t xml:space="preserve"> Se considerará incidente cualquier acceso, pérdida, alteración, divulgación o uso no autorizado de los datos. El incidente se contendrá el mismo día (revocación de accesos, cambio de contraseñas y aislamiento del archivo) y se notificará en las 24 horas siguientes al investigador principal, al área de protección de datos de la Clínica y al comité de ética en investigación; se evaluarán los datos y titulares afectados, y la Clínica, como responsable, informará a la Superintendencia de Industria y Comercio cuando corresponda, conforme al literal n) del artículo 17 de la Ley 1581 de 2012. Se documentarán el incidente, las acciones correctivas y su cierre.</w:t>
       </w:r>
     </w:p>
     <w:p>
@@ -21830,32 +21830,6 @@
           <w:highlight w:val="yellow"/>
         </w:rPr>
         <w:t xml:space="preserve"> Por tratarse de una población clínica poco frecuente, no se publicarán descripciones de casos individuales; las celdas con menos de cinco pacientes se informarán como «menos de cinco» o se agruparán, con supresión complementaria cuando el valor pueda deducirse por diferencia; la edad se presentará en grupos (menos de 50, 50 a 64, 65 a 74 y 75 años o más) y el año de la cirugía en periodos (2020–2022 y 2023–2025); no se cruzarán en una misma tabla sexo, grupo de edad, periodo, procedimiento y desenlace; no se informarán fechas exactas, municipio de residencia, ocupación ni asegurador; las muertes y las transfusiones pese a la negativa se informarán solo de forma agregada, y no se publicarán gráficos con datos individuales.</w:t>
-      </w:r>
-    </w:p>
-    <w:p>
-      <w:pPr>
-        <w:spacing w:after="160"/>
-        <w:jc w:val="both"/>
-      </w:pPr>
-      <w:r>
-        <w:rPr>
-          <w:b/>
-          <w:bCs/>
-          <w:color w:val="000000"/>
-          <w:sz w:val="24"/>
-          <w:szCs w:val="24"/>
-          <w:highlight w:val="yellow"/>
-        </w:rPr>
-        <w:t xml:space="preserve">Capacitación.</w:t>
-      </w:r>
-      <w:r>
-        <w:rPr>
-          <w:color w:val="000000"/>
-          <w:sz w:val="24"/>
-          <w:szCs w:val="24"/>
-          <w:highlight w:val="yellow"/>
-        </w:rPr>
-        <w:t xml:space="preserve"> Antes de acceder a los datos, los investigadores acreditarán formación vigente en ética de la investigación y buenas prácticas clínicas, y conocerán la política de tratamiento de datos de la Clínica.</w:t>
       </w:r>
     </w:p>
     <w:p>
@@ -23772,25 +23746,6 @@
           <w:highlight w:val="yellow"/>
         </w:rPr>
         <w:t xml:space="preserve">COLOMBIA. MINISTERIO DE COMERCIO, INDUSTRIA Y TURISMO. Decreto 1377 (27, junio, 2013). Por el cual se reglamenta parcialmente la Ley 1581 de 2012. Diario Oficial 48.834. Compilado en el Decreto Único Reglamentario 1074 de 2015.</w:t>
-      </w:r>
-    </w:p>
-    <w:p>
-      <w:pPr>
-        <w:numPr>
-          <w:ilvl w:val="0"/>
-          <w:numId w:val="1"/>
-        </w:numPr>
-        <w:spacing w:after="0"/>
-        <w:jc w:val="both"/>
-      </w:pPr>
-      <w:r>
-        <w:rPr>
-          <w:color w:val="000000"/>
-          <w:sz w:val="24"/>
-          <w:szCs w:val="24"/>
-          <w:highlight w:val="yellow"/>
-        </w:rPr>
-        <w:t xml:space="preserve">COLOMBIA. CONGRESO DE LA REPÚBLICA. Ley 1273 (5, enero, 2009). Por medio de la cual se modifica el Código Penal, se crea un nuevo bien jurídico tutelado –denominado “de la protección de la información y de los datos”– y se preservan integralmente los sistemas que utilicen las tecnologías de la información y las comunicaciones, entre otras disposiciones. Diario Oficial 47.223.</w:t>
       </w:r>
     </w:p>
     <w:p>

</xml_diff>